<commit_message>
depin: Sima Zhang 판정 갱신(AI 이용권 · GPU 증설 각도) · 정본에 TAXON 4026 반영
- business-directions: Sima 10/12 갱신(메모 293 · 수락 뒤 통화 요청 925), Aethir 줄에 상품 출시로 지나간 부분 표시
- site-canon-0910: §4 4026 판매 중 · §4-1 AI Factory Content Access Pass 표(00:00 UTC 스냅샷 적립 규칙 포함), docx 재생성
- work-log: 항목 추가 · 해외 고객 회신의 스냅샷 문구 판단 정정

Co-Authored-By: Claude Opus 5.5 <noreply@anthropic.com>
Claude-Session: https://claude.ai/code/session_014drgzQYBXTLjd1zzmsjRaS
</commit_message>
<xml_diff>
--- a/depin/content/site-canon-0910.docx
+++ b/depin/content/site-canon-0910.docx
@@ -47,7 +47,7 @@
           <w:color w:val="1B1B48"/>
           <w:sz w:val="20"/>
         </w:rPr>
-        <w:t>를 쓰기 위한 참조. 사이트가 바뀌면 이 파일을 갱신한다. 대외 발화 규칙(playbook)은 그대로 — 아래 수치는 "사이트가 말하는 것"이고, 우리 마케팅 문구에서는 여전히 수량·가치를 약속하지 않는다.</w:t>
+        <w:t>를 쓰기 위한 참조. 사이트가 바뀌면 이 파일을 갱신한다. 갱신: 2026-10-12 — §4 택손 4026 공개 반영 + §4-1 AI Factory Content Access Pass(서우가 상품 페이지 전문 전달, 페이지 SPEC 2026-09-18). 대외 발화 규칙(playbook)은 그대로 — 아래 수치는 "사이트가 말하는 것"이고, 우리 마케팅 문구에서는 여전히 수량·가치를 약속하지 않는다.</w:t>
       </w:r>
     </w:p>
     <w:p>
@@ -1502,7 +1502,7 @@
                 <w:color w:val="1B1B48"/>
                 <w:sz w:val="18"/>
               </w:rPr>
-              <w:t>4026 / 5026 / 6026</w:t>
+              <w:t>4026</w:t>
             </w:r>
           </w:p>
         </w:tc>
@@ -1518,7 +1518,82 @@
                 <w:color w:val="1B1B48"/>
                 <w:sz w:val="18"/>
               </w:rPr>
-              <w:t>AI 인프라 / 레이다 / 위성</w:t>
+              <w:t>AI 인프라 이용권(AI Factory Content Access Pass)</w:t>
+            </w:r>
+          </w:p>
+        </w:tc>
+        <w:tc>
+          <w:tcPr>
+            <w:tcW w:type="dxa" w:w="3699"/>
+          </w:tcPr>
+          <w:p>
+            <w:r/>
+            <w:r>
+              <w:rPr>
+                <w:rFonts w:ascii="Malgun Gothic" w:hAnsi="Malgun Gothic" w:eastAsia="Malgun Gothic"/>
+                <w:color w:val="1B1B48"/>
+                <w:sz w:val="18"/>
+              </w:rPr>
+              <w:t>장당 1 · 양도 가능 · 계정당 최대 100장</w:t>
+            </w:r>
+          </w:p>
+        </w:tc>
+        <w:tc>
+          <w:tcPr>
+            <w:tcW w:type="dxa" w:w="3699"/>
+          </w:tcPr>
+          <w:p>
+            <w:r/>
+            <w:r>
+              <w:rPr>
+                <w:rFonts w:ascii="Malgun Gothic" w:hAnsi="Malgun Gothic" w:eastAsia="Malgun Gothic"/>
+                <w:b/>
+                <w:color w:val="1B1B48"/>
+                <w:sz w:val="18"/>
+              </w:rPr>
+              <w:t>판매 중(10/12)</w:t>
+            </w:r>
+            <w:r>
+              <w:rPr>
+                <w:rFonts w:ascii="Malgun Gothic" w:hAnsi="Malgun Gothic" w:eastAsia="Malgun Gothic"/>
+                <w:color w:val="1B1B48"/>
+                <w:sz w:val="18"/>
+              </w:rPr>
+              <w:t xml:space="preserve"> → §4-1</w:t>
+            </w:r>
+          </w:p>
+        </w:tc>
+      </w:tr>
+      <w:tr>
+        <w:tc>
+          <w:tcPr>
+            <w:tcW w:type="dxa" w:w="3699"/>
+          </w:tcPr>
+          <w:p>
+            <w:r/>
+            <w:r>
+              <w:rPr>
+                <w:rFonts w:ascii="Malgun Gothic" w:hAnsi="Malgun Gothic" w:eastAsia="Malgun Gothic"/>
+                <w:color w:val="1B1B48"/>
+                <w:sz w:val="18"/>
+              </w:rPr>
+              <w:t>5026 / 6026</w:t>
+            </w:r>
+          </w:p>
+        </w:tc>
+        <w:tc>
+          <w:tcPr>
+            <w:tcW w:type="dxa" w:w="3699"/>
+          </w:tcPr>
+          <w:p>
+            <w:r/>
+            <w:r>
+              <w:rPr>
+                <w:rFonts w:ascii="Malgun Gothic" w:hAnsi="Malgun Gothic" w:eastAsia="Malgun Gothic"/>
+                <w:color w:val="1B1B48"/>
+                <w:sz w:val="18"/>
+              </w:rPr>
+              <w:t>레이다 / 위성</w:t>
             </w:r>
           </w:p>
         </w:tc>
@@ -1557,6 +1632,492 @@
       </w:tr>
     </w:tbl>
     <w:p/>
+    <w:p>
+      <w:r>
+        <w:rPr>
+          <w:rFonts w:ascii="Malgun Gothic" w:hAnsi="Malgun Gothic" w:eastAsia="Malgun Gothic"/>
+          <w:color w:val="1B1B48"/>
+          <w:sz w:val="20"/>
+        </w:rPr>
+        <w:t>### 4-1. AI Factory Content Access Pass (TAXON 4026 · XLS-20 · 상품 페이지 SPEC 2026-09-18 · 10/12 화면)</w:t>
+      </w:r>
+    </w:p>
+    <w:tbl>
+      <w:tblPr>
+        <w:tblStyle w:val="TableGrid"/>
+        <w:tblW w:type="auto" w:w="0"/>
+        <w:jc w:val="center"/>
+        <w:tblLook w:firstColumn="1" w:firstRow="1" w:lastColumn="0" w:lastRow="0" w:noHBand="0" w:noVBand="1" w:val="04A0"/>
+      </w:tblPr>
+      <w:tblGrid>
+        <w:gridCol w:w="7399"/>
+        <w:gridCol w:w="7399"/>
+      </w:tblGrid>
+      <w:tr>
+        <w:tc>
+          <w:tcPr>
+            <w:tcW w:type="dxa" w:w="7399"/>
+            <w:shd w:val="clear" w:color="auto" w:fill="E8E8F4"/>
+          </w:tcPr>
+          <w:p>
+            <w:r>
+              <w:rPr>
+                <w:b/>
+              </w:rPr>
+            </w:r>
+            <w:r>
+              <w:rPr>
+                <w:rFonts w:ascii="Malgun Gothic" w:hAnsi="Malgun Gothic" w:eastAsia="Malgun Gothic"/>
+                <w:b/>
+                <w:color w:val="1B1B48"/>
+                <w:sz w:val="18"/>
+              </w:rPr>
+              <w:t>항목</w:t>
+            </w:r>
+          </w:p>
+        </w:tc>
+        <w:tc>
+          <w:tcPr>
+            <w:tcW w:type="dxa" w:w="7399"/>
+            <w:shd w:val="clear" w:color="auto" w:fill="E8E8F4"/>
+          </w:tcPr>
+          <w:p>
+            <w:r>
+              <w:rPr>
+                <w:b/>
+              </w:rPr>
+            </w:r>
+            <w:r>
+              <w:rPr>
+                <w:rFonts w:ascii="Malgun Gothic" w:hAnsi="Malgun Gothic" w:eastAsia="Malgun Gothic"/>
+                <w:b/>
+                <w:color w:val="1B1B48"/>
+                <w:sz w:val="18"/>
+              </w:rPr>
+              <w:t>값</w:t>
+            </w:r>
+          </w:p>
+        </w:tc>
+      </w:tr>
+      <w:tr>
+        <w:tc>
+          <w:tcPr>
+            <w:tcW w:type="dxa" w:w="7399"/>
+          </w:tcPr>
+          <w:p>
+            <w:r/>
+            <w:r>
+              <w:rPr>
+                <w:rFonts w:ascii="Malgun Gothic" w:hAnsi="Malgun Gothic" w:eastAsia="Malgun Gothic"/>
+                <w:color w:val="1B1B48"/>
+                <w:sz w:val="18"/>
+              </w:rPr>
+              <w:t>발행사</w:t>
+            </w:r>
+          </w:p>
+        </w:tc>
+        <w:tc>
+          <w:tcPr>
+            <w:tcW w:type="dxa" w:w="7399"/>
+          </w:tcPr>
+          <w:p>
+            <w:r/>
+            <w:r>
+              <w:rPr>
+                <w:rFonts w:ascii="Malgun Gothic" w:hAnsi="Malgun Gothic" w:eastAsia="Malgun Gothic"/>
+                <w:color w:val="1B1B48"/>
+                <w:sz w:val="18"/>
+              </w:rPr>
+              <w:t>Wellbian Labs Pte. Ltd.</w:t>
+            </w:r>
+          </w:p>
+        </w:tc>
+      </w:tr>
+      <w:tr>
+        <w:tc>
+          <w:tcPr>
+            <w:tcW w:type="dxa" w:w="7399"/>
+          </w:tcPr>
+          <w:p>
+            <w:r/>
+            <w:r>
+              <w:rPr>
+                <w:rFonts w:ascii="Malgun Gothic" w:hAnsi="Malgun Gothic" w:eastAsia="Malgun Gothic"/>
+                <w:color w:val="1B1B48"/>
+                <w:sz w:val="18"/>
+              </w:rPr>
+              <w:t>기반 인프라</w:t>
+            </w:r>
+          </w:p>
+        </w:tc>
+        <w:tc>
+          <w:tcPr>
+            <w:tcW w:type="dxa" w:w="7399"/>
+          </w:tcPr>
+          <w:p>
+            <w:r/>
+            <w:r>
+              <w:rPr>
+                <w:rFonts w:ascii="Malgun Gothic" w:hAnsi="Malgun Gothic" w:eastAsia="Malgun Gothic"/>
+                <w:color w:val="1B1B48"/>
+                <w:sz w:val="18"/>
+              </w:rPr>
+              <w:t>B300 8-GPU AI Factory — 「구축을 마치고 운영 중 · 수요에 비해 부족해 GPU 서버 증설 중」</w:t>
+            </w:r>
+          </w:p>
+        </w:tc>
+      </w:tr>
+      <w:tr>
+        <w:tc>
+          <w:tcPr>
+            <w:tcW w:type="dxa" w:w="7399"/>
+          </w:tcPr>
+          <w:p>
+            <w:r/>
+            <w:r>
+              <w:rPr>
+                <w:rFonts w:ascii="Malgun Gothic" w:hAnsi="Malgun Gothic" w:eastAsia="Malgun Gothic"/>
+                <w:color w:val="1B1B48"/>
+                <w:sz w:val="18"/>
+              </w:rPr>
+              <w:t>가격 · 수량</w:t>
+            </w:r>
+          </w:p>
+        </w:tc>
+        <w:tc>
+          <w:tcPr>
+            <w:tcW w:type="dxa" w:w="7399"/>
+          </w:tcPr>
+          <w:p>
+            <w:r/>
+            <w:r>
+              <w:rPr>
+                <w:rFonts w:ascii="Malgun Gothic" w:hAnsi="Malgun Gothic" w:eastAsia="Malgun Gothic"/>
+                <w:color w:val="1B1B48"/>
+                <w:sz w:val="18"/>
+              </w:rPr>
+              <w:t>장당 380 RLUSD(RLUSD 결제만) · 발행 4,000장 · 완판 시까지 · 계정당 최대 100장 · 10/12 화면 판매 101 / 4,000 · 할인 코드 입력란 있음</w:t>
+            </w:r>
+          </w:p>
+        </w:tc>
+      </w:tr>
+      <w:tr>
+        <w:tc>
+          <w:tcPr>
+            <w:tcW w:type="dxa" w:w="7399"/>
+          </w:tcPr>
+          <w:p>
+            <w:r/>
+            <w:r>
+              <w:rPr>
+                <w:rFonts w:ascii="Malgun Gothic" w:hAnsi="Malgun Gothic" w:eastAsia="Malgun Gothic"/>
+                <w:color w:val="1B1B48"/>
+                <w:sz w:val="18"/>
+              </w:rPr>
+              <w:t>지급</w:t>
+            </w:r>
+          </w:p>
+        </w:tc>
+        <w:tc>
+          <w:tcPr>
+            <w:tcW w:type="dxa" w:w="7399"/>
+          </w:tcPr>
+          <w:p>
+            <w:r/>
+            <w:r>
+              <w:rPr>
+                <w:rFonts w:ascii="Malgun Gothic" w:hAnsi="Malgun Gothic" w:eastAsia="Malgun Gothic"/>
+                <w:color w:val="1B1B48"/>
+                <w:sz w:val="18"/>
+              </w:rPr>
+              <w:t>3년(발급일 기준 1,095일) 매일 5 토큰 / 장 · 장당 누적 5,475 · 지급 토큰 = WLBN · 수량 · 가치 비보장</w:t>
+            </w:r>
+          </w:p>
+        </w:tc>
+      </w:tr>
+      <w:tr>
+        <w:tc>
+          <w:tcPr>
+            <w:tcW w:type="dxa" w:w="7399"/>
+          </w:tcPr>
+          <w:p>
+            <w:r/>
+            <w:r>
+              <w:rPr>
+                <w:rFonts w:ascii="Malgun Gothic" w:hAnsi="Malgun Gothic" w:eastAsia="Malgun Gothic"/>
+                <w:color w:val="1B1B48"/>
+                <w:sz w:val="18"/>
+              </w:rPr>
+              <w:t>적립 지갑 규칙</w:t>
+            </w:r>
+          </w:p>
+        </w:tc>
+        <w:tc>
+          <w:tcPr>
+            <w:tcW w:type="dxa" w:w="7399"/>
+          </w:tcPr>
+          <w:p>
+            <w:r/>
+            <w:r>
+              <w:rPr>
+                <w:rFonts w:ascii="Malgun Gothic" w:hAnsi="Malgun Gothic" w:eastAsia="Malgun Gothic"/>
+                <w:color w:val="1B1B48"/>
+                <w:sz w:val="18"/>
+              </w:rPr>
+              <w:t xml:space="preserve">매일 </w:t>
+            </w:r>
+            <w:r>
+              <w:rPr>
+                <w:rFonts w:ascii="Malgun Gothic" w:hAnsi="Malgun Gothic" w:eastAsia="Malgun Gothic"/>
+                <w:b/>
+                <w:color w:val="1B1B48"/>
+                <w:sz w:val="18"/>
+              </w:rPr>
+              <w:t>00:00 UTC 스냅샷</w:t>
+            </w:r>
+            <w:r>
+              <w:rPr>
+                <w:rFonts w:ascii="Malgun Gothic" w:hAnsi="Malgun Gothic" w:eastAsia="Malgun Gothic"/>
+                <w:color w:val="1B1B48"/>
+                <w:sz w:val="18"/>
+              </w:rPr>
+              <w:t xml:space="preserve"> 시점에 NFT 를 보유한 지갑에 적립 · 양도하면 그다음 스냅샷부터 새 보유 지갑 · 이미 적립된 몫은 적립 당시 지갑에 남음 · 발행 · 수락 전(핫월렛 보관)에는 구매 지갑 · 원장 조회 실패일은 직전 보유 지갑 · 적립분은 </w:t>
+            </w:r>
+            <w:r>
+              <w:rPr>
+                <w:rFonts w:ascii="Malgun Gothic" w:hAnsi="Malgun Gothic" w:eastAsia="Malgun Gothic"/>
+                <w:b/>
+                <w:color w:val="1B1B48"/>
+                <w:sz w:val="18"/>
+              </w:rPr>
+              <w:t>기기 보상과 같은 24시간 보류</w:t>
+            </w:r>
+            <w:r>
+              <w:rPr>
+                <w:rFonts w:ascii="Malgun Gothic" w:hAnsi="Malgun Gothic" w:eastAsia="Malgun Gothic"/>
+                <w:color w:val="1B1B48"/>
+                <w:sz w:val="18"/>
+              </w:rPr>
+              <w:t xml:space="preserve"> 뒤 클레임</w:t>
+            </w:r>
+          </w:p>
+        </w:tc>
+      </w:tr>
+      <w:tr>
+        <w:tc>
+          <w:tcPr>
+            <w:tcW w:type="dxa" w:w="7399"/>
+          </w:tcPr>
+          <w:p>
+            <w:r/>
+            <w:r>
+              <w:rPr>
+                <w:rFonts w:ascii="Malgun Gothic" w:hAnsi="Malgun Gothic" w:eastAsia="Malgun Gothic"/>
+                <w:color w:val="1B1B48"/>
+                <w:sz w:val="18"/>
+              </w:rPr>
+              <w:t>사용처</w:t>
+            </w:r>
+          </w:p>
+        </w:tc>
+        <w:tc>
+          <w:tcPr>
+            <w:tcW w:type="dxa" w:w="7399"/>
+          </w:tcPr>
+          <w:p>
+            <w:r/>
+            <w:r>
+              <w:rPr>
+                <w:rFonts w:ascii="Malgun Gothic" w:hAnsi="Malgun Gothic" w:eastAsia="Malgun Gothic"/>
+                <w:color w:val="1B1B48"/>
+                <w:sz w:val="18"/>
+              </w:rPr>
+              <w:t>AI 팩토리 플랫폼 콘텐츠 결제 — 날씨 AI 에이전트(LLM) · 정제 날씨 데이터셋 · 날씨 데이터 · AI 추론 API · 결제에 쓴 토큰은 소각</w:t>
+            </w:r>
+          </w:p>
+        </w:tc>
+      </w:tr>
+      <w:tr>
+        <w:tc>
+          <w:tcPr>
+            <w:tcW w:type="dxa" w:w="7399"/>
+          </w:tcPr>
+          <w:p>
+            <w:r/>
+            <w:r>
+              <w:rPr>
+                <w:rFonts w:ascii="Malgun Gothic" w:hAnsi="Malgun Gothic" w:eastAsia="Malgun Gothic"/>
+                <w:color w:val="1B1B48"/>
+                <w:sz w:val="18"/>
+              </w:rPr>
+              <w:t>고정 토큰가</w:t>
+            </w:r>
+          </w:p>
+        </w:tc>
+        <w:tc>
+          <w:tcPr>
+            <w:tcW w:type="dxa" w:w="7399"/>
+          </w:tcPr>
+          <w:p>
+            <w:r/>
+            <w:r>
+              <w:rPr>
+                <w:rFonts w:ascii="Malgun Gothic" w:hAnsi="Malgun Gothic" w:eastAsia="Malgun Gothic"/>
+                <w:color w:val="1B1B48"/>
+                <w:sz w:val="18"/>
+              </w:rPr>
+              <w:t>카탈로그 토큰가가 보유자에게 3년 고정 · 미사용 토큰 소멸 없음</w:t>
+            </w:r>
+          </w:p>
+        </w:tc>
+      </w:tr>
+      <w:tr>
+        <w:tc>
+          <w:tcPr>
+            <w:tcW w:type="dxa" w:w="7399"/>
+          </w:tcPr>
+          <w:p>
+            <w:r/>
+            <w:r>
+              <w:rPr>
+                <w:rFonts w:ascii="Malgun Gothic" w:hAnsi="Malgun Gothic" w:eastAsia="Malgun Gothic"/>
+                <w:color w:val="1B1B48"/>
+                <w:sz w:val="18"/>
+              </w:rPr>
+              <w:t>양도 · 환불</w:t>
+            </w:r>
+          </w:p>
+        </w:tc>
+        <w:tc>
+          <w:tcPr>
+            <w:tcW w:type="dxa" w:w="7399"/>
+          </w:tcPr>
+          <w:p>
+            <w:r/>
+            <w:r>
+              <w:rPr>
+                <w:rFonts w:ascii="Malgun Gothic" w:hAnsi="Malgun Gothic" w:eastAsia="Malgun Gothic"/>
+                <w:color w:val="1B1B48"/>
+                <w:sz w:val="18"/>
+              </w:rPr>
+              <w:t>NFT · 토큰 모두 양도 가능 · 발행된 이용권 환불 없음</w:t>
+            </w:r>
+          </w:p>
+        </w:tc>
+      </w:tr>
+      <w:tr>
+        <w:tc>
+          <w:tcPr>
+            <w:tcW w:type="dxa" w:w="7399"/>
+          </w:tcPr>
+          <w:p>
+            <w:r/>
+            <w:r>
+              <w:rPr>
+                <w:rFonts w:ascii="Malgun Gothic" w:hAnsi="Malgun Gothic" w:eastAsia="Malgun Gothic"/>
+                <w:color w:val="1B1B48"/>
+                <w:sz w:val="18"/>
+              </w:rPr>
+              <w:t>운영</w:t>
+            </w:r>
+          </w:p>
+        </w:tc>
+        <w:tc>
+          <w:tcPr>
+            <w:tcW w:type="dxa" w:w="7399"/>
+          </w:tcPr>
+          <w:p>
+            <w:r/>
+            <w:r>
+              <w:rPr>
+                <w:rFonts w:ascii="Malgun Gothic" w:hAnsi="Malgun Gothic" w:eastAsia="Malgun Gothic"/>
+                <w:color w:val="1B1B48"/>
+                <w:sz w:val="18"/>
+              </w:rPr>
+              <w:t>월 가용률 95% 목표(SLA) · 미달 시 일일 지급량 보전 또는 기간 연장 · 장애 시 외부 GPU 자원 임시 대체 · 산출물 상업 이용은 품목별 라이선스</w:t>
+            </w:r>
+          </w:p>
+        </w:tc>
+      </w:tr>
+    </w:tbl>
+    <w:p/>
+    <w:p>
+      <w:pPr>
+        <w:pStyle w:val="ListBullet"/>
+      </w:pPr>
+      <w:r>
+        <w:rPr>
+          <w:rFonts w:ascii="Malgun Gothic" w:hAnsi="Malgun Gothic" w:eastAsia="Malgun Gothic"/>
+          <w:b/>
+          <w:color w:val="1B1B48"/>
+          <w:sz w:val="20"/>
+        </w:rPr>
+        <w:t>우리 규칙과의 정합</w:t>
+      </w:r>
+      <w:r>
+        <w:rPr>
+          <w:rFonts w:ascii="Malgun Gothic" w:hAnsi="Malgun Gothic" w:eastAsia="Malgun Gothic"/>
+          <w:color w:val="1B1B48"/>
+          <w:sz w:val="20"/>
+        </w:rPr>
+        <w:t>: 위 수치는 「사이트가 말하는 것」. 대외 발화(링크드인 · DM · X)에서 적립량 · 가격 · 수량은 쓰지 않고 「a pass issued on the XRP Ledger」로 부른다. 추천 코드 · KOL 배포는 매일 적립 상품의 판매 권유라 카운슬 확인 뒤(business-directions Aethir 줄 10/12 갱신).</w:t>
+      </w:r>
+    </w:p>
+    <w:p>
+      <w:pPr>
+        <w:pStyle w:val="ListBullet"/>
+      </w:pPr>
+      <w:r>
+        <w:rPr>
+          <w:rFonts w:ascii="Malgun Gothic" w:hAnsi="Malgun Gothic" w:eastAsia="Malgun Gothic"/>
+          <w:b/>
+          <w:color w:val="1B1B48"/>
+          <w:sz w:val="20"/>
+        </w:rPr>
+        <w:t>확인 필요(10/12)</w:t>
+      </w:r>
+      <w:r>
+        <w:rPr>
+          <w:rFonts w:ascii="Malgun Gothic" w:hAnsi="Malgun Gothic" w:eastAsia="Malgun Gothic"/>
+          <w:color w:val="1B1B48"/>
+          <w:sz w:val="20"/>
+        </w:rPr>
+        <w:t xml:space="preserve">: ① 스냅샷 적립 지갑 규칙이 </w:t>
+      </w:r>
+      <w:r>
+        <w:rPr>
+          <w:rFonts w:ascii="Malgun Gothic" w:hAnsi="Malgun Gothic" w:eastAsia="Malgun Gothic"/>
+          <w:b/>
+          <w:color w:val="1B1B48"/>
+          <w:sz w:val="20"/>
+        </w:rPr>
+        <w:t>기기 NFT(3026)에도 같은지</w:t>
+      </w:r>
+      <w:r>
+        <w:rPr>
+          <w:rFonts w:ascii="Malgun Gothic" w:hAnsi="Malgun Gothic" w:eastAsia="Malgun Gothic"/>
+          <w:color w:val="1B1B48"/>
+          <w:sz w:val="20"/>
+        </w:rPr>
+        <w:t xml:space="preserve"> — 이 페이지는 이용권 규칙이고, 기기 쪽은 §2 「배송 전까지 포인트」 · FAQ 「출금 개시 전 계정 포인트」만 있다(10/12 해외 고객 문의가 이 문구로 들어왔다) ② 「24시간 보류 뒤 클레임」과 FAQ 「출금 개시 전 계정 포인트」가 같은 흐름인지(클레임 = 계정 잔액?) ③ FAQ(</w:t>
+      </w:r>
+      <w:r>
+        <w:rPr>
+          <w:rFonts w:ascii="Consolas" w:hAnsi="Consolas" w:eastAsia="Malgun Gothic"/>
+          <w:color w:val="1B1B48"/>
+          <w:sz w:val="20"/>
+        </w:rPr>
+        <w:t>lib/data.ts</w:t>
+      </w:r>
+      <w:r>
+        <w:rPr>
+          <w:rFonts w:ascii="Malgun Gothic" w:hAnsi="Malgun Gothic" w:eastAsia="Malgun Gothic"/>
+          <w:color w:val="1B1B48"/>
+          <w:sz w:val="20"/>
+        </w:rPr>
+        <w:t>)에 이용권 문항을 넣을지 — 서우 결정.</w:t>
+      </w:r>
+    </w:p>
     <w:p>
       <w:pPr>
         <w:spacing w:before="280"/>

</xml_diff>

<commit_message>
depin: record AMM pool / LP participation reward page in canon, blogger LP reply
Canon gets a new section 8 with the public AMM pool, supply/withdraw and
LP participation reward wording; playbook's "no AMM swap before
withdrawals open" line is flagged for confirmation since the page now
allows swaps and supply.

Co-Authored-By: Claude Opus 5.5 <noreply@anthropic.com>
Claude-Session: https://claude.ai/code/session_014drgzQYBXTLjd1zzmsjRaS
</commit_message>
<xml_diff>
--- a/depin/content/site-canon-0910.docx
+++ b/depin/content/site-canon-0910.docx
@@ -3478,6 +3478,389 @@
         <w:t xml:space="preserve"> (사실과 다르거나 법적 노출) → 사이트 개발자 + 법무. B · D · F · G · S · T 는 다음 배포에서.</w:t>
       </w:r>
     </w:p>
+    <w:p>
+      <w:pPr>
+        <w:spacing w:before="280"/>
+      </w:pPr>
+      <w:r>
+        <w:rPr>
+          <w:rFonts w:ascii="Malgun Gothic" w:hAnsi="Malgun Gothic" w:eastAsia="Malgun Gothic"/>
+          <w:b/>
+          <w:color w:val="1B1B48"/>
+          <w:sz w:val="26"/>
+        </w:rPr>
+        <w:t>8. AMM 풀 · 유동성 공급 · LP 참여 보상 (10/14 서우가 붙여 넣은 사이트 화면 · XRPL 탐색기 캡처)</w:t>
+      </w:r>
+    </w:p>
+    <w:tbl>
+      <w:tblPr>
+        <w:tblStyle w:val="TableGrid"/>
+        <w:tblW w:type="auto" w:w="0"/>
+        <w:jc w:val="center"/>
+        <w:tblLook w:firstColumn="1" w:firstRow="1" w:lastColumn="0" w:lastRow="0" w:noHBand="0" w:noVBand="1" w:val="04A0"/>
+      </w:tblPr>
+      <w:tblGrid>
+        <w:gridCol w:w="7399"/>
+        <w:gridCol w:w="7399"/>
+      </w:tblGrid>
+      <w:tr>
+        <w:tc>
+          <w:tcPr>
+            <w:tcW w:type="dxa" w:w="7399"/>
+            <w:shd w:val="clear" w:color="auto" w:fill="E8E8F4"/>
+          </w:tcPr>
+          <w:p>
+            <w:r>
+              <w:rPr>
+                <w:b/>
+              </w:rPr>
+            </w:r>
+            <w:r>
+              <w:rPr>
+                <w:rFonts w:ascii="Malgun Gothic" w:hAnsi="Malgun Gothic" w:eastAsia="Malgun Gothic"/>
+                <w:b/>
+                <w:color w:val="1B1B48"/>
+                <w:sz w:val="18"/>
+              </w:rPr>
+              <w:t>항목</w:t>
+            </w:r>
+          </w:p>
+        </w:tc>
+        <w:tc>
+          <w:tcPr>
+            <w:tcW w:type="dxa" w:w="7399"/>
+            <w:shd w:val="clear" w:color="auto" w:fill="E8E8F4"/>
+          </w:tcPr>
+          <w:p>
+            <w:r>
+              <w:rPr>
+                <w:b/>
+              </w:rPr>
+            </w:r>
+            <w:r>
+              <w:rPr>
+                <w:rFonts w:ascii="Malgun Gothic" w:hAnsi="Malgun Gothic" w:eastAsia="Malgun Gothic"/>
+                <w:b/>
+                <w:color w:val="1B1B48"/>
+                <w:sz w:val="18"/>
+              </w:rPr>
+              <w:t>사이트 공개 문구</w:t>
+            </w:r>
+          </w:p>
+        </w:tc>
+      </w:tr>
+      <w:tr>
+        <w:tc>
+          <w:tcPr>
+            <w:tcW w:type="dxa" w:w="7399"/>
+          </w:tcPr>
+          <w:p>
+            <w:r/>
+            <w:r>
+              <w:rPr>
+                <w:rFonts w:ascii="Malgun Gothic" w:hAnsi="Malgun Gothic" w:eastAsia="Malgun Gothic"/>
+                <w:color w:val="1B1B48"/>
+                <w:sz w:val="18"/>
+              </w:rPr>
+              <w:t>풀</w:t>
+            </w:r>
+          </w:p>
+        </w:tc>
+        <w:tc>
+          <w:tcPr>
+            <w:tcW w:type="dxa" w:w="7399"/>
+          </w:tcPr>
+          <w:p>
+            <w:r/>
+            <w:r>
+              <w:rPr>
+                <w:rFonts w:ascii="Malgun Gothic" w:hAnsi="Malgun Gothic" w:eastAsia="Malgun Gothic"/>
+                <w:color w:val="1B1B48"/>
+                <w:sz w:val="18"/>
+              </w:rPr>
+              <w:t xml:space="preserve">XRPL 자동 환전 풀(AMM, XLS-30) RLUSD / WLBN · 풀 계정 </w:t>
+            </w:r>
+            <w:r>
+              <w:rPr>
+                <w:rFonts w:ascii="Consolas" w:hAnsi="Consolas" w:eastAsia="Malgun Gothic"/>
+                <w:color w:val="1B1B48"/>
+                <w:sz w:val="18"/>
+              </w:rPr>
+              <w:t>rHKzsTuYWqzgX7VsRKubGWYtK1qkQ6kUQF</w:t>
+            </w:r>
+            <w:r>
+              <w:rPr>
+                <w:rFonts w:ascii="Malgun Gothic" w:hAnsi="Malgun Gothic" w:eastAsia="Malgun Gothic"/>
+                <w:color w:val="1B1B48"/>
+                <w:sz w:val="18"/>
+              </w:rPr>
+              <w:t xml:space="preserve"> · 서명은 이용자 지갑, 웰비안은 자산을 맡지 않음</w:t>
+            </w:r>
+          </w:p>
+        </w:tc>
+      </w:tr>
+      <w:tr>
+        <w:tc>
+          <w:tcPr>
+            <w:tcW w:type="dxa" w:w="7399"/>
+          </w:tcPr>
+          <w:p>
+            <w:r/>
+            <w:r>
+              <w:rPr>
+                <w:rFonts w:ascii="Malgun Gothic" w:hAnsi="Malgun Gothic" w:eastAsia="Malgun Gothic"/>
+                <w:color w:val="1B1B48"/>
+                <w:sz w:val="18"/>
+              </w:rPr>
+              <w:t>전환 수수료</w:t>
+            </w:r>
+          </w:p>
+        </w:tc>
+        <w:tc>
+          <w:tcPr>
+            <w:tcW w:type="dxa" w:w="7399"/>
+          </w:tcPr>
+          <w:p>
+            <w:r/>
+            <w:r>
+              <w:rPr>
+                <w:rFonts w:ascii="Malgun Gothic" w:hAnsi="Malgun Gothic" w:eastAsia="Malgun Gothic"/>
+                <w:color w:val="1B1B48"/>
+                <w:sz w:val="18"/>
+              </w:rPr>
+              <w:t>0.50% — 풀 안에 남아 LP 토큰 가치로 쌓이고 회수 때 함께 돌아옴(별도 지급 없음). 수수료율은 LP 보유자 투표(AMMVote), 회사가 임의로 바꾸지 않음</w:t>
+            </w:r>
+          </w:p>
+        </w:tc>
+      </w:tr>
+      <w:tr>
+        <w:tc>
+          <w:tcPr>
+            <w:tcW w:type="dxa" w:w="7399"/>
+          </w:tcPr>
+          <w:p>
+            <w:r/>
+            <w:r>
+              <w:rPr>
+                <w:rFonts w:ascii="Malgun Gothic" w:hAnsi="Malgun Gothic" w:eastAsia="Malgun Gothic"/>
+                <w:color w:val="1B1B48"/>
+                <w:sz w:val="18"/>
+              </w:rPr>
+              <w:t>공급 방식</w:t>
+            </w:r>
+          </w:p>
+        </w:tc>
+        <w:tc>
+          <w:tcPr>
+            <w:tcW w:type="dxa" w:w="7399"/>
+          </w:tcPr>
+          <w:p>
+            <w:r/>
+            <w:r>
+              <w:rPr>
+                <w:rFonts w:ascii="Malgun Gothic" w:hAnsi="Malgun Gothic" w:eastAsia="Malgun Gothic"/>
+                <w:color w:val="1B1B48"/>
+                <w:sz w:val="18"/>
+              </w:rPr>
+              <w:t>WLBN + RLUSD(같은 가치) · WLBN 만 · RLUSD 만 · XRP 로. 최소 50 RLUSD 상당. 첫 공급 때 LP 토큰 트러스트라인 예치 0.2 XRP(소비 아님)</w:t>
+            </w:r>
+          </w:p>
+        </w:tc>
+      </w:tr>
+      <w:tr>
+        <w:tc>
+          <w:tcPr>
+            <w:tcW w:type="dxa" w:w="7399"/>
+          </w:tcPr>
+          <w:p>
+            <w:r/>
+            <w:r>
+              <w:rPr>
+                <w:rFonts w:ascii="Malgun Gothic" w:hAnsi="Malgun Gothic" w:eastAsia="Malgun Gothic"/>
+                <w:color w:val="1B1B48"/>
+                <w:sz w:val="18"/>
+              </w:rPr>
+              <w:t>회수</w:t>
+            </w:r>
+          </w:p>
+        </w:tc>
+        <w:tc>
+          <w:tcPr>
+            <w:tcW w:type="dxa" w:w="7399"/>
+          </w:tcPr>
+          <w:p>
+            <w:r/>
+            <w:r>
+              <w:rPr>
+                <w:rFonts w:ascii="Malgun Gothic" w:hAnsi="Malgun Gothic" w:eastAsia="Malgun Gothic"/>
+                <w:color w:val="1B1B48"/>
+                <w:sz w:val="18"/>
+              </w:rPr>
+              <w:t>잠금 · 최소 기간 · 대기 없음, 25 · 50 · 75 · 100% 부분 회수. 돌려받는 것은 회수 시점 풀 비율의 WLBN + RLUSD(한 자산 · XRP 로 넣어도 두 자산으로). 비영구 손실 고지</w:t>
+            </w:r>
+          </w:p>
+        </w:tc>
+      </w:tr>
+      <w:tr>
+        <w:tc>
+          <w:tcPr>
+            <w:tcW w:type="dxa" w:w="7399"/>
+          </w:tcPr>
+          <w:p>
+            <w:r/>
+            <w:r>
+              <w:rPr>
+                <w:rFonts w:ascii="Malgun Gothic" w:hAnsi="Malgun Gothic" w:eastAsia="Malgun Gothic"/>
+                <w:color w:val="1B1B48"/>
+                <w:sz w:val="18"/>
+              </w:rPr>
+              <w:t>LP 참여 보상 프로그램</w:t>
+            </w:r>
+          </w:p>
+        </w:tc>
+        <w:tc>
+          <w:tcPr>
+            <w:tcW w:type="dxa" w:w="7399"/>
+          </w:tcPr>
+          <w:p>
+            <w:r/>
+            <w:r>
+              <w:rPr>
+                <w:rFonts w:ascii="Malgun Gothic" w:hAnsi="Malgun Gothic" w:eastAsia="Malgun Gothic"/>
+                <w:b/>
+                <w:color w:val="1B1B48"/>
+                <w:sz w:val="18"/>
+              </w:rPr>
+              <w:t>시작 전</w:t>
+            </w:r>
+            <w:r>
+              <w:rPr>
+                <w:rFonts w:ascii="Malgun Gothic" w:hAnsi="Malgun Gothic" w:eastAsia="Malgun Gothic"/>
+                <w:color w:val="1B1B48"/>
+                <w:sz w:val="18"/>
+              </w:rPr>
+              <w:t xml:space="preserve"> · 2026-11-01 ~ 2027-04-30 · 월 예산 50,000 WLBN · 지갑당 월 상한 5,000 WLBN · 자격 = 등급 NFT(관측소 멤버십) 또는 AI 이용권 NFT 보유 지갑 · 매일 00:00 UTC LP 보유량 × 노드 가중(기기 0대 0.8 · 1~2대 1 · 3~9대 1.1 · 10대+ 1.2) · 상한 초과 · 미배분분 예산 환수 · 회사 · 파트너 운영 지갑 제외 · 「예산 고정 참여 보상이며 이자 · 수익률이 아님」 · 일별 배분 · 지급 해시는 /token/transparency</w:t>
+            </w:r>
+          </w:p>
+        </w:tc>
+      </w:tr>
+      <w:tr>
+        <w:tc>
+          <w:tcPr>
+            <w:tcW w:type="dxa" w:w="7399"/>
+          </w:tcPr>
+          <w:p>
+            <w:r/>
+            <w:r>
+              <w:rPr>
+                <w:rFonts w:ascii="Malgun Gothic" w:hAnsi="Malgun Gothic" w:eastAsia="Malgun Gothic"/>
+                <w:color w:val="1B1B48"/>
+                <w:sz w:val="18"/>
+              </w:rPr>
+              <w:t>공개 누적 수수료</w:t>
+            </w:r>
+          </w:p>
+        </w:tc>
+        <w:tc>
+          <w:tcPr>
+            <w:tcW w:type="dxa" w:w="7399"/>
+          </w:tcPr>
+          <w:p>
+            <w:r/>
+            <w:r>
+              <w:rPr>
+                <w:rFonts w:ascii="Malgun Gothic" w:hAnsi="Malgun Gothic" w:eastAsia="Malgun Gothic"/>
+                <w:color w:val="1B1B48"/>
+                <w:sz w:val="18"/>
+              </w:rPr>
+              <w:t xml:space="preserve">화면 표시(10/14): 2026-10-02 이후 전환 254건 · 규모 148,408 RLUSD 상당 · 누적 수수료 742.04 RLUSD — </w:t>
+            </w:r>
+            <w:r>
+              <w:rPr>
+                <w:rFonts w:ascii="Malgun Gothic" w:hAnsi="Malgun Gothic" w:eastAsia="Malgun Gothic"/>
+                <w:b/>
+                <w:color w:val="1B1B48"/>
+                <w:sz w:val="18"/>
+              </w:rPr>
+              <w:t>대외 인용 0</w:t>
+            </w:r>
+            <w:r>
+              <w:rPr>
+                <w:rFonts w:ascii="Malgun Gothic" w:hAnsi="Malgun Gothic" w:eastAsia="Malgun Gothic"/>
+                <w:color w:val="1B1B48"/>
+                <w:sz w:val="18"/>
+              </w:rPr>
+              <w:t>(수익 암시로 읽힘)</w:t>
+            </w:r>
+          </w:p>
+        </w:tc>
+      </w:tr>
+    </w:tbl>
+    <w:p/>
+    <w:p>
+      <w:pPr>
+        <w:pStyle w:val="ListBullet"/>
+      </w:pPr>
+      <w:r>
+        <w:rPr>
+          <w:rFonts w:ascii="Malgun Gothic" w:hAnsi="Malgun Gothic" w:eastAsia="Malgun Gothic"/>
+          <w:b/>
+          <w:color w:val="1B1B48"/>
+          <w:sz w:val="20"/>
+        </w:rPr>
+        <w:t>§7 D · playbook 「AMM 상시 교환 → 출금 개시 전 교환 불가」와 어긋난다.</w:t>
+      </w:r>
+      <w:r>
+        <w:rPr>
+          <w:rFonts w:ascii="Malgun Gothic" w:hAnsi="Malgun Gothic" w:eastAsia="Malgun Gothic"/>
+          <w:color w:val="1B1B48"/>
+          <w:sz w:val="20"/>
+        </w:rPr>
+        <w:t xml:space="preserve"> 화면은 전환 · 공급을 열어 두었고 10/2 이후 전환 기록이 있다. 출금 · DEX 개방이 정본(G4)에서 바뀐 것인지(Genesis 가이드 PDF 는 G2 — </w:t>
+      </w:r>
+      <w:r>
+        <w:rPr>
+          <w:rFonts w:ascii="Consolas" w:hAnsi="Consolas" w:eastAsia="Malgun Gothic"/>
+          <w:color w:val="1B1B48"/>
+          <w:sz w:val="20"/>
+        </w:rPr>
+        <w:t>genesis-guide-review-1013.md</w:t>
+      </w:r>
+      <w:r>
+        <w:rPr>
+          <w:rFonts w:ascii="Malgun Gothic" w:hAnsi="Malgun Gothic" w:eastAsia="Malgun Gothic"/>
+          <w:color w:val="1B1B48"/>
+          <w:sz w:val="20"/>
+        </w:rPr>
+        <w:t xml:space="preserve"> B-3) 서우 확인 뒤 §1 · §7 D · playbook 규칙을 고친다.</w:t>
+      </w:r>
+    </w:p>
+    <w:p>
+      <w:pPr>
+        <w:pStyle w:val="ListBullet"/>
+      </w:pPr>
+      <w:r>
+        <w:rPr>
+          <w:rFonts w:ascii="Malgun Gothic" w:hAnsi="Malgun Gothic" w:eastAsia="Malgun Gothic"/>
+          <w:color w:val="1B1B48"/>
+          <w:sz w:val="20"/>
+        </w:rPr>
+        <w:t>LP 참여 보상은 Genesis 가이드 검토 B-4(「Staking pool」)와 같은 갈래 — 화면 문구는 「이자 · 수익률 아님」으로 조심했지만 카운슬 질문은 그대로 둔다.</w:t>
+      </w:r>
+    </w:p>
+    <w:p>
+      <w:pPr>
+        <w:pStyle w:val="ListBullet"/>
+      </w:pPr>
+      <w:r>
+        <w:rPr>
+          <w:rFonts w:ascii="Malgun Gothic" w:hAnsi="Malgun Gothic" w:eastAsia="Malgun Gothic"/>
+          <w:color w:val="1B1B48"/>
+          <w:sz w:val="20"/>
+        </w:rPr>
+        <w:t>우리 채널에서 말할 때: 「공급하는 쪽은 이용자 · RLUSD 별도 지급 없음 · 참여 보상은 WLBN · 수익률 약속 없음 · 비영구 손실」. 수수료 누적액 · 풀 가격은 말하지 않는다.</w:t>
+      </w:r>
+    </w:p>
     <w:sectPr>
       <w:pgSz w:w="16838" w:h="11906" w:orient="landscape"/>
       <w:pgMar w:top="1020" w:right="1020" w:bottom="1020" w:left="1020" w:header="720" w:footer="720" w:gutter="0"/>

</xml_diff>

<commit_message>
depin: swap confirmed open - canon note, playbook AMM rule, sheet note
Co-Authored-By: Claude Opus 5.5 <noreply@anthropic.com>
Claude-Session: https://claude.ai/code/session_014drgzQYBXTLjd1zzmsjRaS
</commit_message>
<xml_diff>
--- a/depin/content/site-canon-0910.docx
+++ b/depin/content/site-canon-0910.docx
@@ -3832,7 +3832,40 @@
           <w:color w:val="1B1B48"/>
           <w:sz w:val="20"/>
         </w:rPr>
-        <w:t xml:space="preserve"> B-3) 서우 확인 뒤 §1 · §7 D · playbook 규칙을 고친다.</w:t>
+        <w:t xml:space="preserve"> B-3) 서우 확인 뒤 §1 · §7 D · playbook 규칙을 고친다. → </w:t>
+      </w:r>
+      <w:r>
+        <w:rPr>
+          <w:rFonts w:ascii="Malgun Gothic" w:hAnsi="Malgun Gothic" w:eastAsia="Malgun Gothic"/>
+          <w:b/>
+          <w:color w:val="1B1B48"/>
+          <w:sz w:val="20"/>
+        </w:rPr>
+        <w:t>10/16 · 10/17 서우 확인(운영 사실): 교환 정상 작동 — 적립분은 바로 XRP · RLUSD 로 스왑된다.</w:t>
+      </w:r>
+      <w:r>
+        <w:rPr>
+          <w:rFonts w:ascii="Malgun Gothic" w:hAnsi="Malgun Gothic" w:eastAsia="Malgun Gothic"/>
+          <w:color w:val="1B1B48"/>
+          <w:sz w:val="20"/>
+        </w:rPr>
+        <w:t xml:space="preserve"> 출금 · 교환은 열린 상태로 본다. 남은 일: 사이트 원문(/token · 백서 G4 문구 · FAQ 「출금 개시 전 계정 포인트」)이 아직 옛 문구인지 확인 → 사이트 쪽 정리 뒤 §1 · §7 D · FAQ(</w:t>
+      </w:r>
+      <w:r>
+        <w:rPr>
+          <w:rFonts w:ascii="Consolas" w:hAnsi="Consolas" w:eastAsia="Malgun Gothic"/>
+          <w:color w:val="1B1B48"/>
+          <w:sz w:val="20"/>
+        </w:rPr>
+        <w:t>lib/data.ts</w:t>
+      </w:r>
+      <w:r>
+        <w:rPr>
+          <w:rFonts w:ascii="Malgun Gothic" w:hAnsi="Malgun Gothic" w:eastAsia="Malgun Gothic"/>
+          <w:color w:val="1B1B48"/>
+          <w:sz w:val="20"/>
+        </w:rPr>
+        <w:t>)를 갱신 순서대로 고친다.</w:t>
       </w:r>
     </w:p>
     <w:p>

</xml_diff>

<commit_message>
depin: record that the Genesis +20% bonus is being paid
Operator confirmation; the site still says planned, so the canon keeps
the site wording and adds a note under section 7 G. FAQ follows once the
site text changes.

Co-Authored-By: Claude Opus 5.5 <noreply@anthropic.com>
Claude-Session: https://claude.ai/code/session_014drgzQYBXTLjd1zzmsjRaS
</commit_message>
<xml_diff>
--- a/depin/content/site-canon-0910.docx
+++ b/depin/content/site-canon-0910.docx
@@ -47,7 +47,7 @@
           <w:color w:val="1B1B48"/>
           <w:sz w:val="20"/>
         </w:rPr>
-        <w:t>를 쓰기 위한 참조. 사이트가 바뀌면 이 파일을 갱신한다. 갱신: 2026-10-12 — §4 택손 4026 공개 반영 + §4-1 AI Factory Content Access Pass(서우가 상품 페이지 전문 전달, 페이지 SPEC 2026-09-18). 대외 발화 규칙(playbook)은 그대로 — 아래 수치는 "사이트가 말하는 것"이고, 우리 마케팅 문구에서는 여전히 수량·가치를 약속하지 않는다.</w:t>
+        <w:t>를 쓰기 위한 참조. 사이트가 바뀌면 이 파일을 갱신한다. 갱신: 2026-10-12 — §4 택손 4026 공개 반영 + §4-1 AI Factory Content Access Pass(서우가 상품 페이지 전문 전달, 페이지 SPEC 2026-09-18). 갱신: 2026-10-21 — §7 G 운영 사실 메모(제네시스 +20% 실제 지급 중 · 서우 확인). 사이트 원문은 아직 「(예정)」으로 보여 아래 §1 · §4 표기는 그대로 둔다. 대외 발화 규칙(playbook)은 그대로 — 아래 수치는 "사이트가 말하는 것"이고, 우리 마케팅 문구에서는 여전히 수량·가치를 약속하지 않는다.</w:t>
       </w:r>
     </w:p>
     <w:p>
@@ -3002,7 +3002,40 @@
                 <w:color w:val="1B1B48"/>
                 <w:sz w:val="18"/>
               </w:rPr>
-              <w:t>/membership "제네시스 보상 토큰 20% 가산(예정)" vs 백서 보상식 7 × 0.78^(p−1) × 등급(0/1.0/1.2)에 제네시스 배수 없음</w:t>
+              <w:t xml:space="preserve">/membership "제네시스 보상 토큰 20% 가산(예정)" vs 백서 보상식 7 × 0.78^(p−1) × 등급(0/1.0/1.2)에 제네시스 배수 없음 </w:t>
+            </w:r>
+            <w:r>
+              <w:rPr>
+                <w:rFonts w:ascii="Malgun Gothic" w:hAnsi="Malgun Gothic" w:eastAsia="Malgun Gothic"/>
+                <w:b/>
+                <w:color w:val="1B1B48"/>
+                <w:sz w:val="18"/>
+              </w:rPr>
+              <w:t>→ 10/21 서우 확인(운영 사실): 제네시스 +20% 실제 지급 중.</w:t>
+            </w:r>
+            <w:r>
+              <w:rPr>
+                <w:rFonts w:ascii="Malgun Gothic" w:hAnsi="Malgun Gothic" w:eastAsia="Malgun Gothic"/>
+                <w:color w:val="1B1B48"/>
+                <w:sz w:val="18"/>
+              </w:rPr>
+              <w:t xml:space="preserve"> 사이트 「(예정)」 · 백서 산식이 실제보다 뒤처짐 — 사이트 문구가 바뀌면 FAQ(</w:t>
+            </w:r>
+            <w:r>
+              <w:rPr>
+                <w:rFonts w:ascii="Consolas" w:hAnsi="Consolas" w:eastAsia="Malgun Gothic"/>
+                <w:color w:val="1B1B48"/>
+                <w:sz w:val="18"/>
+              </w:rPr>
+              <w:t>lib/data.ts</w:t>
+            </w:r>
+            <w:r>
+              <w:rPr>
+                <w:rFonts w:ascii="Malgun Gothic" w:hAnsi="Malgun Gothic" w:eastAsia="Malgun Gothic"/>
+                <w:color w:val="1B1B48"/>
+                <w:sz w:val="18"/>
+              </w:rPr>
+              <w:t xml:space="preserve"> 제네시스 멤버십 문항 KO/EN) 갱신. 우수 등급 1.2 와 곱하는지 · 고정 예산(7.14) 안인지는 미확인</w:t>
             </w:r>
           </w:p>
         </w:tc>

</xml_diff>